<commit_message>
lld and ppt of phase3 review 2
</commit_message>
<xml_diff>
--- a/docs/Phase III/ECHO_Phase3_Review2_LLD.docx
+++ b/docs/Phase III/ECHO_Phase3_Review2_LLD.docx
@@ -4,9 +4,353 @@
   <w:body>
     <w:p>
       <w:pPr>
-        <w:rPr>
-          <w:rFonts w:ascii="Cambria" w:hAnsi="Cambria"/>
-          <w:sz w:val="24"/>
+        <w:ind w:left="0"/>
+        <w:rPr>
+          <w:rFonts w:ascii="Cambria" w:hAnsi="Cambria"/>
+          <w:sz w:val="24"/>
+        </w:rPr>
+      </w:pPr>
+    </w:p>
+    <w:p>
+      <w:pPr>
+        <w:pStyle w:val="Title"/>
+        <w:rPr>
+          <w:rFonts w:ascii="Cambria" w:hAnsi="Cambria"/>
+          <w:sz w:val="24"/>
+          <w:szCs w:val="24"/>
+        </w:rPr>
+      </w:pPr>
+    </w:p>
+    <w:p>
+      <w:pPr>
+        <w:pStyle w:val="Title"/>
+        <w:rPr>
+          <w:rFonts w:ascii="Cambria" w:hAnsi="Cambria"/>
+          <w:sz w:val="24"/>
+          <w:szCs w:val="24"/>
+        </w:rPr>
+      </w:pPr>
+    </w:p>
+    <w:p>
+      <w:pPr>
+        <w:pStyle w:val="Title"/>
+        <w:rPr>
+          <w:rFonts w:ascii="Cambria" w:hAnsi="Cambria"/>
+          <w:sz w:val="24"/>
+          <w:szCs w:val="24"/>
+        </w:rPr>
+      </w:pPr>
+    </w:p>
+    <w:p>
+      <w:pPr>
+        <w:pStyle w:val="Title"/>
+        <w:rPr>
+          <w:rFonts w:ascii="Cambria" w:hAnsi="Cambria"/>
+          <w:sz w:val="24"/>
+          <w:szCs w:val="24"/>
+        </w:rPr>
+      </w:pPr>
+    </w:p>
+    <w:p>
+      <w:pPr>
+        <w:pStyle w:val="Title"/>
+        <w:rPr>
+          <w:rFonts w:ascii="Cambria" w:hAnsi="Cambria"/>
+          <w:sz w:val="24"/>
+          <w:szCs w:val="24"/>
+        </w:rPr>
+      </w:pPr>
+    </w:p>
+    <w:p>
+      <w:pPr>
+        <w:pStyle w:val="Title"/>
+        <w:rPr>
+          <w:rFonts w:ascii="Cambria" w:hAnsi="Cambria"/>
+          <w:sz w:val="24"/>
+          <w:szCs w:val="24"/>
+        </w:rPr>
+      </w:pPr>
+      <w:r>
+        <w:rPr>
+          <w:rFonts w:ascii="Cambria" w:hAnsi="Cambria"/>
+          <w:sz w:val="24"/>
+        </w:rPr>
+        <w:drawing>
+          <wp:anchor distT="0" distB="0" distL="114300" distR="114300" simplePos="0" relativeHeight="251670528" behindDoc="1" locked="0" layoutInCell="1" allowOverlap="1" wp14:anchorId="1667C64F" wp14:editId="23E70BF1">
+            <wp:simplePos x="0" y="0"/>
+            <wp:positionH relativeFrom="margin">
+              <wp:align>right</wp:align>
+            </wp:positionH>
+            <wp:positionV relativeFrom="paragraph">
+              <wp:posOffset>215900</wp:posOffset>
+            </wp:positionV>
+            <wp:extent cx="5943600" cy="3695700"/>
+            <wp:effectExtent l="0" t="0" r="0" b="0"/>
+            <wp:wrapTight wrapText="bothSides">
+              <wp:wrapPolygon edited="0">
+                <wp:start x="0" y="0"/>
+                <wp:lineTo x="0" y="21489"/>
+                <wp:lineTo x="21531" y="21489"/>
+                <wp:lineTo x="21531" y="0"/>
+                <wp:lineTo x="0" y="0"/>
+              </wp:wrapPolygon>
+            </wp:wrapTight>
+            <wp:docPr id="525407029" name="Picture 1"/>
+            <wp:cNvGraphicFramePr>
+              <a:graphicFrameLocks xmlns:a="http://schemas.openxmlformats.org/drawingml/2006/main" noChangeAspect="1"/>
+            </wp:cNvGraphicFramePr>
+            <a:graphic xmlns:a="http://schemas.openxmlformats.org/drawingml/2006/main">
+              <a:graphicData uri="http://schemas.openxmlformats.org/drawingml/2006/picture">
+                <pic:pic xmlns:pic="http://schemas.openxmlformats.org/drawingml/2006/picture">
+                  <pic:nvPicPr>
+                    <pic:cNvPr id="525407029" name=""/>
+                    <pic:cNvPicPr/>
+                  </pic:nvPicPr>
+                  <pic:blipFill>
+                    <a:blip r:embed="rId7">
+                      <a:extLst>
+                        <a:ext uri="{28A0092B-C50C-407E-A947-70E740481C1C}">
+                          <a14:useLocalDpi xmlns:a14="http://schemas.microsoft.com/office/drawing/2010/main" val="0"/>
+                        </a:ext>
+                      </a:extLst>
+                    </a:blip>
+                    <a:stretch>
+                      <a:fillRect/>
+                    </a:stretch>
+                  </pic:blipFill>
+                  <pic:spPr>
+                    <a:xfrm>
+                      <a:off x="0" y="0"/>
+                      <a:ext cx="5943600" cy="3695700"/>
+                    </a:xfrm>
+                    <a:prstGeom prst="rect">
+                      <a:avLst/>
+                    </a:prstGeom>
+                  </pic:spPr>
+                </pic:pic>
+              </a:graphicData>
+            </a:graphic>
+          </wp:anchor>
+        </w:drawing>
+      </w:r>
+    </w:p>
+    <w:p>
+      <w:pPr>
+        <w:pStyle w:val="Title"/>
+        <w:rPr>
+          <w:rFonts w:ascii="Cambria" w:hAnsi="Cambria"/>
+          <w:sz w:val="24"/>
+          <w:szCs w:val="24"/>
+        </w:rPr>
+      </w:pPr>
+    </w:p>
+    <w:p>
+      <w:pPr>
+        <w:pStyle w:val="Title"/>
+        <w:rPr>
+          <w:rFonts w:ascii="Cambria" w:hAnsi="Cambria"/>
+          <w:sz w:val="24"/>
+          <w:szCs w:val="24"/>
+        </w:rPr>
+      </w:pPr>
+    </w:p>
+    <w:p>
+      <w:pPr>
+        <w:pStyle w:val="Title"/>
+        <w:rPr>
+          <w:rFonts w:ascii="Cambria" w:hAnsi="Cambria"/>
+          <w:sz w:val="24"/>
+          <w:szCs w:val="24"/>
+        </w:rPr>
+      </w:pPr>
+    </w:p>
+    <w:p>
+      <w:pPr>
+        <w:pStyle w:val="Title"/>
+        <w:rPr>
+          <w:rFonts w:ascii="Cambria" w:hAnsi="Cambria"/>
+          <w:sz w:val="24"/>
+          <w:szCs w:val="24"/>
+        </w:rPr>
+      </w:pPr>
+    </w:p>
+    <w:p>
+      <w:pPr>
+        <w:pStyle w:val="Title"/>
+        <w:rPr>
+          <w:rFonts w:ascii="Cambria" w:hAnsi="Cambria"/>
+          <w:sz w:val="24"/>
+          <w:szCs w:val="24"/>
+        </w:rPr>
+      </w:pPr>
+    </w:p>
+    <w:p>
+      <w:pPr>
+        <w:pStyle w:val="Title"/>
+        <w:rPr>
+          <w:rFonts w:ascii="Cambria" w:hAnsi="Cambria"/>
+          <w:sz w:val="24"/>
+          <w:szCs w:val="24"/>
+        </w:rPr>
+      </w:pPr>
+    </w:p>
+    <w:p>
+      <w:pPr>
+        <w:pStyle w:val="Title"/>
+        <w:rPr>
+          <w:rFonts w:ascii="Cambria" w:hAnsi="Cambria"/>
+          <w:sz w:val="24"/>
+          <w:szCs w:val="24"/>
+        </w:rPr>
+      </w:pPr>
+    </w:p>
+    <w:p>
+      <w:pPr>
+        <w:pStyle w:val="Title"/>
+        <w:rPr>
+          <w:rFonts w:ascii="Cambria" w:hAnsi="Cambria"/>
+          <w:sz w:val="24"/>
+          <w:szCs w:val="24"/>
+        </w:rPr>
+      </w:pPr>
+    </w:p>
+    <w:p>
+      <w:pPr>
+        <w:pStyle w:val="Title"/>
+        <w:rPr>
+          <w:rFonts w:ascii="Cambria" w:hAnsi="Cambria"/>
+          <w:sz w:val="24"/>
+          <w:szCs w:val="24"/>
+        </w:rPr>
+      </w:pPr>
+    </w:p>
+    <w:p>
+      <w:pPr>
+        <w:pStyle w:val="Title"/>
+        <w:rPr>
+          <w:rFonts w:ascii="Cambria" w:hAnsi="Cambria"/>
+          <w:sz w:val="24"/>
+          <w:szCs w:val="24"/>
+        </w:rPr>
+      </w:pPr>
+    </w:p>
+    <w:p>
+      <w:pPr>
+        <w:pStyle w:val="Title"/>
+        <w:rPr>
+          <w:rFonts w:ascii="Cambria" w:hAnsi="Cambria"/>
+          <w:sz w:val="24"/>
+          <w:szCs w:val="24"/>
+        </w:rPr>
+      </w:pPr>
+    </w:p>
+    <w:p>
+      <w:pPr>
+        <w:pStyle w:val="Title"/>
+        <w:rPr>
+          <w:rFonts w:ascii="Cambria" w:hAnsi="Cambria"/>
+          <w:sz w:val="24"/>
+          <w:szCs w:val="24"/>
+        </w:rPr>
+      </w:pPr>
+    </w:p>
+    <w:p>
+      <w:pPr>
+        <w:pStyle w:val="Title"/>
+        <w:rPr>
+          <w:rFonts w:ascii="Cambria" w:hAnsi="Cambria"/>
+          <w:sz w:val="24"/>
+          <w:szCs w:val="24"/>
+        </w:rPr>
+      </w:pPr>
+    </w:p>
+    <w:p>
+      <w:pPr>
+        <w:pStyle w:val="Title"/>
+        <w:rPr>
+          <w:rFonts w:ascii="Cambria" w:hAnsi="Cambria"/>
+          <w:sz w:val="24"/>
+          <w:szCs w:val="24"/>
+        </w:rPr>
+      </w:pPr>
+    </w:p>
+    <w:p>
+      <w:pPr>
+        <w:pStyle w:val="Title"/>
+        <w:rPr>
+          <w:rFonts w:ascii="Cambria" w:hAnsi="Cambria"/>
+          <w:sz w:val="24"/>
+          <w:szCs w:val="24"/>
+        </w:rPr>
+      </w:pPr>
+    </w:p>
+    <w:p>
+      <w:pPr>
+        <w:pStyle w:val="Title"/>
+        <w:rPr>
+          <w:rFonts w:ascii="Cambria" w:hAnsi="Cambria"/>
+          <w:sz w:val="24"/>
+          <w:szCs w:val="24"/>
+        </w:rPr>
+      </w:pPr>
+    </w:p>
+    <w:p>
+      <w:pPr>
+        <w:pStyle w:val="Title"/>
+        <w:rPr>
+          <w:rFonts w:ascii="Cambria" w:hAnsi="Cambria"/>
+          <w:sz w:val="24"/>
+          <w:szCs w:val="24"/>
+        </w:rPr>
+      </w:pPr>
+    </w:p>
+    <w:p>
+      <w:pPr>
+        <w:pStyle w:val="Title"/>
+        <w:rPr>
+          <w:rFonts w:ascii="Cambria" w:hAnsi="Cambria"/>
+          <w:sz w:val="24"/>
+          <w:szCs w:val="24"/>
+        </w:rPr>
+      </w:pPr>
+    </w:p>
+    <w:p>
+      <w:pPr>
+        <w:pStyle w:val="Title"/>
+        <w:rPr>
+          <w:rFonts w:ascii="Cambria" w:hAnsi="Cambria"/>
+          <w:sz w:val="24"/>
+          <w:szCs w:val="24"/>
+        </w:rPr>
+      </w:pPr>
+    </w:p>
+    <w:p>
+      <w:pPr>
+        <w:pStyle w:val="Title"/>
+        <w:rPr>
+          <w:rFonts w:ascii="Cambria" w:hAnsi="Cambria"/>
+          <w:sz w:val="24"/>
+          <w:szCs w:val="24"/>
+        </w:rPr>
+      </w:pPr>
+    </w:p>
+    <w:p>
+      <w:pPr>
+        <w:pStyle w:val="Title"/>
+        <w:rPr>
+          <w:rFonts w:ascii="Cambria" w:hAnsi="Cambria"/>
+          <w:sz w:val="24"/>
+          <w:szCs w:val="24"/>
+        </w:rPr>
+      </w:pPr>
+    </w:p>
+    <w:p>
+      <w:pPr>
+        <w:pStyle w:val="Title"/>
+        <w:rPr>
+          <w:rFonts w:ascii="Cambria" w:hAnsi="Cambria"/>
+          <w:sz w:val="24"/>
+          <w:szCs w:val="24"/>
         </w:rPr>
       </w:pPr>
     </w:p>
@@ -110,7 +454,7 @@
                           </pic:cNvPicPr>
                         </pic:nvPicPr>
                         <pic:blipFill>
-                          <a:blip r:embed="rId7">
+                          <a:blip r:embed="rId8">
                             <a:extLst>
                               <a:ext uri="{28A0092B-C50C-407E-A947-70E740481C1C}">
                                 <a14:useLocalDpi xmlns:a14="http://schemas.microsoft.com/office/drawing/2010/main" val="0"/>
@@ -914,6 +1258,7 @@
                 <w:bCs/>
                 <w:sz w:val="24"/>
               </w:rPr>
+              <w:lastRenderedPageBreak/>
               <w:t>PES UNIVERSITY</w:t>
             </w:r>
           </w:p>
@@ -2516,6 +2861,7 @@
                 <w:rFonts w:ascii="Cambria" w:hAnsi="Cambria"/>
                 <w:sz w:val="24"/>
               </w:rPr>
+              <w:lastRenderedPageBreak/>
               <w:t xml:space="preserve">                  3.3.3.23   Class Name 6: Reranker</w:t>
             </w:r>
           </w:p>
@@ -2614,7 +2960,6 @@
                 <w:rFonts w:ascii="Cambria" w:hAnsi="Cambria"/>
                 <w:sz w:val="24"/>
               </w:rPr>
-              <w:lastRenderedPageBreak/>
               <w:t xml:space="preserve">         3.3.4   Sequence Diagram</w:t>
             </w:r>
           </w:p>
@@ -5618,7 +5963,7 @@
                     <pic:cNvPicPr/>
                   </pic:nvPicPr>
                   <pic:blipFill>
-                    <a:blip r:embed="rId8"/>
+                    <a:blip r:embed="rId9"/>
                     <a:stretch>
                       <a:fillRect/>
                     </a:stretch>
@@ -6856,7 +7201,7 @@
                     <pic:cNvPicPr/>
                   </pic:nvPicPr>
                   <pic:blipFill>
-                    <a:blip r:embed="rId9"/>
+                    <a:blip r:embed="rId10"/>
                     <a:stretch>
                       <a:fillRect/>
                     </a:stretch>
@@ -6928,7 +7273,7 @@
                     <pic:cNvPicPr/>
                   </pic:nvPicPr>
                   <pic:blipFill>
-                    <a:blip r:embed="rId10"/>
+                    <a:blip r:embed="rId11"/>
                     <a:stretch>
                       <a:fillRect/>
                     </a:stretch>
@@ -7718,7 +8063,7 @@
                     <pic:cNvPicPr/>
                   </pic:nvPicPr>
                   <pic:blipFill>
-                    <a:blip r:embed="rId11"/>
+                    <a:blip r:embed="rId12"/>
                     <a:stretch>
                       <a:fillRect/>
                     </a:stretch>
@@ -21863,7 +22208,7 @@
                     <pic:cNvPicPr/>
                   </pic:nvPicPr>
                   <pic:blipFill>
-                    <a:blip r:embed="rId12"/>
+                    <a:blip r:embed="rId13"/>
                     <a:stretch>
                       <a:fillRect/>
                     </a:stretch>
@@ -22376,7 +22721,7 @@
                     <pic:cNvPicPr/>
                   </pic:nvPicPr>
                   <pic:blipFill>
-                    <a:blip r:embed="rId13"/>
+                    <a:blip r:embed="rId14"/>
                     <a:stretch>
                       <a:fillRect/>
                     </a:stretch>
@@ -23124,7 +23469,7 @@
                     <pic:cNvPicPr/>
                   </pic:nvPicPr>
                   <pic:blipFill>
-                    <a:blip r:embed="rId14"/>
+                    <a:blip r:embed="rId15"/>
                     <a:stretch>
                       <a:fillRect/>
                     </a:stretch>
@@ -35185,7 +35530,7 @@
                     <pic:cNvPicPr/>
                   </pic:nvPicPr>
                   <pic:blipFill>
-                    <a:blip r:embed="rId15"/>
+                    <a:blip r:embed="rId16"/>
                     <a:stretch>
                       <a:fillRect/>
                     </a:stretch>
@@ -35565,7 +35910,7 @@
                     <pic:cNvPicPr/>
                   </pic:nvPicPr>
                   <pic:blipFill>
-                    <a:blip r:embed="rId16"/>
+                    <a:blip r:embed="rId17"/>
                     <a:stretch>
                       <a:fillRect/>
                     </a:stretch>
@@ -36339,7 +36684,7 @@
                     <pic:cNvPicPr/>
                   </pic:nvPicPr>
                   <pic:blipFill>
-                    <a:blip r:embed="rId17"/>
+                    <a:blip r:embed="rId18"/>
                     <a:stretch>
                       <a:fillRect/>
                     </a:stretch>
@@ -42090,7 +42435,7 @@
                     <pic:cNvPicPr/>
                   </pic:nvPicPr>
                   <pic:blipFill>
-                    <a:blip r:embed="rId18"/>
+                    <a:blip r:embed="rId19"/>
                     <a:stretch>
                       <a:fillRect/>
                     </a:stretch>
@@ -42203,7 +42548,7 @@
                     <pic:cNvPicPr/>
                   </pic:nvPicPr>
                   <pic:blipFill>
-                    <a:blip r:embed="rId19"/>
+                    <a:blip r:embed="rId20"/>
                     <a:stretch>
                       <a:fillRect/>
                     </a:stretch>
@@ -43666,7 +44011,7 @@
                     <pic:cNvPicPr/>
                   </pic:nvPicPr>
                   <pic:blipFill>
-                    <a:blip r:embed="rId20"/>
+                    <a:blip r:embed="rId21"/>
                     <a:stretch>
                       <a:fillRect/>
                     </a:stretch>
@@ -49277,8 +49622,8 @@
       </w:pPr>
     </w:p>
     <w:sectPr>
-      <w:headerReference w:type="default" r:id="rId21"/>
-      <w:footerReference w:type="default" r:id="rId22"/>
+      <w:headerReference w:type="default" r:id="rId22"/>
+      <w:footerReference w:type="default" r:id="rId23"/>
       <w:pgSz w:w="12240" w:h="15840"/>
       <w:pgMar w:top="1440" w:right="1440" w:bottom="1440" w:left="1440" w:header="720" w:footer="720" w:gutter="0"/>
       <w:cols w:space="720"/>

</xml_diff>